<commit_message>
RC1.17.12: assistant visible, diagnostics discrets et filtres des lots actualises
</commit_message>
<xml_diff>
--- a/DOC/Domenia-1.0-Guide-technicien.docx
+++ b/DOC/Domenia-1.0-Guide-technicien.docx
@@ -152,7 +152,7 @@
           <w:sz w:val="20"/>
           <w:szCs w:val="20"/>
         </w:rPr>
-        <w:t xml:space="preserve">Domenia 1.0</w:t>
+        <w:t xml:space="preserve">Domenia 1.0 · RC1.17.12</w:t>
       </w:r>
     </w:p>
     <w:p>
@@ -4720,6 +4720,88 @@
     </w:p>
     <w:p>
       <w:pPr>
+        <w:pStyle w:val="Heading2"/>
+        <w:keepNext/>
+      </w:pPr>
+      <w:r>
+        <w:t xml:space="preserve">Suivre un lot</w:t>
+      </w:r>
+    </w:p>
+    <w:p>
+      <w:pPr>
+        <w:keepNext w:val="false"/>
+      </w:pPr>
+      <w:r>
+        <w:t xml:space="preserve">Le bouton Opérations de lʼen-tête affiche le type de lot et les postes traités sur le total.</w:t>
+      </w:r>
+    </w:p>
+    <w:p>
+      <w:pPr>
+        <w:keepNext w:val="false"/>
+      </w:pPr>
+      <w:r>
+        <w:t xml:space="preserve">Son panneau place le lot avant les lectures individuelles, avec les erreurs et les enregistrements en attente.</w:t>
+      </w:r>
+    </w:p>
+    <w:p>
+      <w:pPr>
+        <w:keepNext w:val="false"/>
+      </w:pPr>
+      <w:r>
+        <w:t xml:space="preserve">Le lot reste visible entre deux postes ; son bouton Arrêter agit sur lʼensemble du lot choisi.</w:t>
+      </w:r>
+    </w:p>
+    <w:p>
+      <w:pPr>
+        <w:keepNext w:val="false"/>
+      </w:pPr>
+      <w:r>
+        <w:t xml:space="preserve">Un délai WMI concerne le poste en erreur. Si le moteur est encore occupé à nettoyer les lectures,</w:t>
+      </w:r>
+    </w:p>
+    <w:p>
+      <w:pPr>
+        <w:keepNext w:val="false"/>
+      </w:pPr>
+      <w:r>
+        <w:t xml:space="preserve">le prochain poste attend une place avant de partir ; les limites du moteur restent appliquées.</w:t>
+      </w:r>
+    </w:p>
+    <w:p>
+      <w:pPr>
+        <w:pStyle w:val="Heading2"/>
+        <w:keepNext/>
+      </w:pPr>
+      <w:r>
+        <w:t xml:space="preserve">Dates et actualisation des widgets</w:t>
+      </w:r>
+    </w:p>
+    <w:p>
+      <w:pPr>
+        <w:keepNext w:val="false"/>
+      </w:pPr>
+      <w:r>
+        <w:t xml:space="preserve">Chaque widget présente sa source (AD, ping, WMI ou registre) et les dates des relevés conservés. Une plage indique des relevés réalisés à plusieurs moments ; une source sans date reste « non daté ». Le petit ↻ toujours visible relit la source, puis recalcule le widget. Les données confirmées gardent leur date si une tentative échoue. La synthèse du parc enchaîne AD puis ses mesures ping/WMI ; les historiques restent conservés. Un widget suspendu doit être repris avant actualisation. Les confirmations de collecte et les limites de périmètre restent applicables.</w:t>
+      </w:r>
+    </w:p>
+    <w:p>
+      <w:pPr>
+        <w:keepNext w:val="false"/>
+      </w:pPr>
+      <w:r>
+        <w:t xml:space="preserve">L’assistant de première configuration reste en haut de l’Accueil tant que ses étapes ne sont pas terminées. Au dernier pas, un premier calcul local démarre automatiquement après la lecture de la base. Le bouton attend la vue prête ; en cas d’échec ou d’OU vide, il propose de réessayer. Aucun scan WMI supplémentaire ne part à cette étape.</w:t>
+      </w:r>
+    </w:p>
+    <w:p>
+      <w:pPr>
+        <w:keepNext w:val="false"/>
+      </w:pPr>
+      <w:r>
+        <w:t xml:space="preserve">Les lenteurs passagères sont consultables dans le diagnostic des opérations. Elles ne produisent plus un avertissement répété dans le journal de session ; les échecs et les actions nécessaires restent signalés.</w:t>
+      </w:r>
+    </w:p>
+    <w:p>
+      <w:pPr>
         <w:pStyle w:val="Heading1"/>
         <w:keepNext/>
       </w:pPr>
@@ -5625,7 +5707,15 @@
         <w:keepNext w:val="false"/>
       </w:pPr>
       <w:r>
-        <w:t xml:space="preserve">L'Accueil présente les postes de la base locale et leurs derniers relevés. Son choix d'OU est indépendant de Rechercher : vous pouvez suivre un service dans le tableau de bord tout en cherchant un autre objet dans l'annuaire.</w:t>
+        <w:t xml:space="preserve">L'Accueil présente les postes de la base locale et leurs derniers relevés. L’assistant de première configuration apparaît en haut jusqu’à sa fin, puis les données du parc occupent directement l’Accueil. Son choix d'OU est indépendant de Rechercher : vous pouvez suivre un service dans le tableau de bord tout en cherchant un autre objet dans l'annuaire.</w:t>
+      </w:r>
+    </w:p>
+    <w:p>
+      <w:pPr>
+        <w:keepNext w:val="false"/>
+      </w:pPr>
+      <w:r>
+        <w:t xml:space="preserve">Dans Personnaliser, utilisez Monter ou Descendre près du titre d’une section pour la déplacer avec tous ses widgets. L’ordre est mémorisé ; Annuler rétablit l’ordre précédent. Santé est placée en dernier par défaut. Compacte, Moyenne et Large gardent leur taille même si une ligne reste incomplète.</w:t>
       </w:r>
     </w:p>
     <w:p>

</xml_diff>

<commit_message>
docs: refresh RC20 Windows qualification evidence and guides
</commit_message>
<xml_diff>
--- a/DOC/Domenia-1.0-Guide-technicien.docx
+++ b/DOC/Domenia-1.0-Guide-technicien.docx
@@ -152,7 +152,7 @@
           <w:sz w:val="20"/>
           <w:szCs w:val="20"/>
         </w:rPr>
-        <w:t xml:space="preserve">Domenia 1.0 · RC1.17.12</w:t>
+        <w:t xml:space="preserve">Domenia 1.0 · RC1.17.20</w:t>
       </w:r>
     </w:p>
     <w:p>
@@ -469,7 +469,7 @@
       <w:r>
         <w:drawing>
           <wp:inline distT="0" distB="0" distL="0" distR="0">
-            <wp:extent cx="3600450" cy="3409950"/>
+            <wp:extent cx="3600450" cy="4105275"/>
             <wp:effectExtent t="0" r="0" b="0" l="0"/>
             <wp:docPr id="1" name="connexion" descr="Fenêtre « Connexion à Domenia » : compte, mot de passe, « Se connecter » et « Continuer en tant que … »" title="Figure 1"/>
             <wp:cNvGraphicFramePr>
@@ -486,7 +486,7 @@
                   </pic:nvPicPr>
                   <pic:blipFill>
                     <a:blip r:embed="rId12" cstate="none"/>
-                    <a:srcRect l="38698" t="30926" r="38698" b="31019"/>
+                    <a:srcRect l="38438" t="26574" r="38438" b="26574"/>
                     <a:stretch>
                       <a:fillRect/>
                     </a:stretch>
@@ -494,7 +494,7 @@
                   <pic:spPr bwMode="auto">
                     <a:xfrm>
                       <a:off x="0" y="0"/>
-                      <a:ext cx="3600450" cy="3409950"/>
+                      <a:ext cx="3600450" cy="4105275"/>
                     </a:xfrm>
                     <a:prstGeom prst="rect">
                       <a:avLst/>
@@ -553,6 +553,23 @@
       </w:r>
       <w:r>
         <w:t xml:space="preserve">Domenia est ouvert avec l'interrupteur sur « Lecture seule » : vous consultez sans rien modifier.</w:t>
+      </w:r>
+    </w:p>
+    <w:p>
+      <w:pPr>
+        <w:pStyle w:val="Heading2"/>
+        <w:keepNext/>
+      </w:pPr>
+      <w:r>
+        <w:t xml:space="preserve">Retrouver sa fenêtre à la réouverture</w:t>
+      </w:r>
+    </w:p>
+    <w:p>
+      <w:pPr>
+        <w:keepNext w:val="false"/>
+      </w:pPr>
+      <w:r>
+        <w:t xml:space="preserve">Domenia conserve automatiquement la taille, la position et l’état normal ou maximisé de sa fenêtre. Après une fermeture maximisée, rétablir la fenêtre retrouve sa taille normale précédente. Si un écran a été retiré, la fenêtre revient dans la zone visible du bureau.</w:t>
       </w:r>
     </w:p>
     <w:p>
@@ -1488,7 +1505,7 @@
       <w:r>
         <w:drawing>
           <wp:inline distT="0" distB="0" distL="0" distR="0">
-            <wp:extent cx="5762625" cy="304800"/>
+            <wp:extent cx="5762625" cy="609600"/>
             <wp:effectExtent t="0" r="0" b="0" l="0"/>
             <wp:docPr id="1" name="recherche-requetes" descr="Barre Requêtes : recherche locale du modèle, favoris, source et commande Exécuter ; données fictives" title="Figure 2"/>
             <wp:cNvGraphicFramePr>
@@ -1505,7 +1522,7 @@
                   </pic:nvPicPr>
                   <pic:blipFill>
                     <a:blip r:embed="rId13" cstate="none"/>
-                    <a:srcRect l="26875" t="27407" r="1250" b="65926"/>
+                    <a:srcRect l="26979" t="29167" r="1250" b="57407"/>
                     <a:stretch>
                       <a:fillRect/>
                     </a:stretch>
@@ -1513,7 +1530,7 @@
                   <pic:spPr bwMode="auto">
                     <a:xfrm>
                       <a:off x="0" y="0"/>
-                      <a:ext cx="5762625" cy="304800"/>
+                      <a:ext cx="5762625" cy="609600"/>
                     </a:xfrm>
                     <a:prstGeom prst="rect">
                       <a:avLst/>
@@ -1567,7 +1584,7 @@
       <w:r>
         <w:drawing>
           <wp:inline distT="0" distB="0" distL="0" distR="0">
-            <wp:extent cx="5762625" cy="228600"/>
+            <wp:extent cx="5762625" cy="295275"/>
             <wp:effectExtent t="0" r="0" b="0" l="0"/>
             <wp:docPr id="1" name="recherche-inconnus" descr="Requête locale : sélection des postes dont les données nécessaires restent inconnues ; données fictives" title="Figure 3"/>
             <wp:cNvGraphicFramePr>
@@ -1584,7 +1601,7 @@
                   </pic:nvPicPr>
                   <pic:blipFill>
                     <a:blip r:embed="rId14" cstate="none"/>
-                    <a:srcRect l="26875" t="35926" r="23646" b="60556"/>
+                    <a:srcRect l="26979" t="36111" r="1250" b="57407"/>
                     <a:stretch>
                       <a:fillRect/>
                     </a:stretch>
@@ -1592,7 +1609,7 @@
                   <pic:spPr bwMode="auto">
                     <a:xfrm>
                       <a:off x="0" y="0"/>
-                      <a:ext cx="5762625" cy="228600"/>
+                      <a:ext cx="5762625" cy="295275"/>
                     </a:xfrm>
                     <a:prstGeom prst="rect">
                       <a:avLst/>
@@ -2513,7 +2530,7 @@
       <w:r>
         <w:drawing>
           <wp:inline distT="0" distB="0" distL="0" distR="0">
-            <wp:extent cx="5762625" cy="561975"/>
+            <wp:extent cx="5762625" cy="2590800"/>
             <wp:effectExtent t="0" r="0" b="0" l="0"/>
             <wp:docPr id="1" name="actions-poste" descr="Vue « Intervenir » : cartes « Se connecter » (Bureau à distance, Ouvrir le disque C, consoles), « Vérifier » (Tester la réponse, diagnostic), « Intervenir » et « Compte AD » ; données fictives" title="Figure 5"/>
             <wp:cNvGraphicFramePr>
@@ -2530,7 +2547,7 @@
                   </pic:nvPicPr>
                   <pic:blipFill>
                     <a:blip r:embed="rId16" cstate="none"/>
-                    <a:srcRect l="12396" t="22222" r="44010" b="70185"/>
+                    <a:srcRect l="11875" t="32870" r="25104" b="16852"/>
                     <a:stretch>
                       <a:fillRect/>
                     </a:stretch>
@@ -2538,7 +2555,7 @@
                   <pic:spPr bwMode="auto">
                     <a:xfrm>
                       <a:off x="0" y="0"/>
-                      <a:ext cx="5762625" cy="561975"/>
+                      <a:ext cx="5762625" cy="2590800"/>
                     </a:xfrm>
                     <a:prstGeom prst="rect">
                       <a:avLst/>
@@ -2584,7 +2601,7 @@
       <w:r>
         <w:drawing>
           <wp:inline distT="0" distB="0" distL="0" distR="0">
-            <wp:extent cx="5038725" cy="352425"/>
+            <wp:extent cx="5038725" cy="3714750"/>
             <wp:effectExtent t="0" r="0" b="0" l="0"/>
             <wp:docPr id="1" name="actions-poste-avancees" descr="Vue « Intervenir » : « Copier la commande PowerShell », « Actualiser les stratégies », « Exécuter un programme… » et « Redémarrer… » ; données fictives" title="Figure 6"/>
             <wp:cNvGraphicFramePr>
@@ -2601,7 +2618,7 @@
                   </pic:nvPicPr>
                   <pic:blipFill>
                     <a:blip r:embed="rId16" cstate="none"/>
-                    <a:srcRect l="55885" t="25556" r="10938" b="70278"/>
+                    <a:srcRect l="43333" t="41759" r="25052" b="16852"/>
                     <a:stretch>
                       <a:fillRect/>
                     </a:stretch>
@@ -2609,7 +2626,7 @@
                   <pic:spPr bwMode="auto">
                     <a:xfrm>
                       <a:off x="0" y="0"/>
-                      <a:ext cx="5038725" cy="352425"/>
+                      <a:ext cx="5038725" cy="3714750"/>
                     </a:xfrm>
                     <a:prstGeom prst="rect">
                       <a:avLst/>
@@ -4960,7 +4977,7 @@
       <w:r>
         <w:drawing>
           <wp:inline distT="0" distB="0" distL="0" distR="0">
-            <wp:extent cx="5762625" cy="295275"/>
+            <wp:extent cx="5762625" cy="895350"/>
             <wp:effectExtent t="0" r="0" b="0" l="0"/>
             <wp:docPr id="1" name="recherche-actions" descr="Ligne d'actions sous les résultats : « Vérifier au clic », « + utilisateur connecté », « Revérifier ce poste » et « Vérifier la liste » avec sa flèche" title="Figure 8"/>
             <wp:cNvGraphicFramePr>
@@ -4977,7 +4994,7 @@
                   </pic:nvPicPr>
                   <pic:blipFill>
                     <a:blip r:embed="rId17" cstate="none"/>
-                    <a:srcRect l="27083" t="49444" r="36771" b="47222"/>
+                    <a:srcRect l="26979" t="43148" r="1250" b="37130"/>
                     <a:stretch>
                       <a:fillRect/>
                     </a:stretch>
@@ -4985,7 +5002,7 @@
                   <pic:spPr bwMode="auto">
                     <a:xfrm>
                       <a:off x="0" y="0"/>
-                      <a:ext cx="5762625" cy="295275"/>
+                      <a:ext cx="5762625" cy="895350"/>
                     </a:xfrm>
                     <a:prstGeom prst="rect">
                       <a:avLst/>
@@ -6655,7 +6672,7 @@
         <w:t xml:space="preserve">Lire la liste.</w:t>
       </w:r>
       <w:r>
-        <w:t xml:space="preserve"> L’onglet « Résultats » affiche les postes correspondants. Le compteur porte sur le résultat complet. La table affiche 200 postes par page ; utilisez les commandes de page pour parcourir la suite.</w:t>
+        <w:t xml:space="preserve"> L’onglet « 2. Aperçu » affiche les postes correspondants. Le compteur porte sur le résultat complet. La table affiche 200 postes par page ; utilisez les commandes de page pour parcourir la suite.</w:t>
       </w:r>
     </w:p>
     <w:p>
@@ -6699,7 +6716,7 @@
         <w:t xml:space="preserve">Préciser ou revenir.</w:t>
       </w:r>
       <w:r>
-        <w:t xml:space="preserve"> Dans « 1. Créer », ajoutez une condition, puis cliquez sur « Exécuter » pour revenir aux résultats. Le bouton « Retour » revient à l’écran précédent.</w:t>
+        <w:t xml:space="preserve"> Dans « 1. Créer », ajoutez une condition, puis cliquez sur « Aperçu local » pour revenir aux résultats. Le bouton « Retour » revient à l’écran précédent.</w:t>
       </w:r>
     </w:p>
     <w:p>
@@ -6711,7 +6728,7 @@
       <w:r>
         <w:drawing>
           <wp:inline distT="0" distB="0" distL="0" distR="0">
-            <wp:extent cx="5762625" cy="800100"/>
+            <wp:extent cx="5762625" cy="1838325"/>
             <wp:effectExtent t="0" r="0" b="0" l="0"/>
             <wp:docPr id="1" name="atelier-fiche-locale" descr="Détail local du poste sélectionné dans l’Atelier ; données fictives" title="Figure 10"/>
             <wp:cNvGraphicFramePr>
@@ -6728,7 +6745,7 @@
                   </pic:nvPicPr>
                   <pic:blipFill>
                     <a:blip r:embed="rId19" cstate="none"/>
-                    <a:srcRect l="14427" t="51210" r="38698" b="38710"/>
+                    <a:srcRect l="14583" t="43952" r="3802" b="15726"/>
                     <a:stretch>
                       <a:fillRect/>
                     </a:stretch>
@@ -6736,7 +6753,7 @@
                   <pic:spPr bwMode="auto">
                     <a:xfrm>
                       <a:off x="0" y="0"/>
-                      <a:ext cx="5762625" cy="800100"/>
+                      <a:ext cx="5762625" cy="1838325"/>
                     </a:xfrm>
                     <a:prstGeom prst="rect">
                       <a:avLst/>
@@ -6866,7 +6883,7 @@
         <w:keepNext w:val="false"/>
       </w:pPr>
       <w:r>
-        <w:t xml:space="preserve">Ouvrez Outils → Atelier de requêtes, ou utilisez la petite icône de la barre du parc. Le petit crayon de Rechercher ouvre également l’Atelier ; une recette locale sélectionnée y est préparée pour modification. Dans l’Atelier, relisez le périmètre du parc affiché en haut : il peut différer de l’OU de Rechercher. Choisissez « Tous les postes recensés », cliquez sur « Charger », puis sur « Exécuter ». Elle inclut les comptes actifs et désactivés du périmètre. Une recherche textuelle dans Rechercher peut donner moins de lignes à cause de sa limite et de ses filtres ; la base et l'Atelier servent à examiner le recensement complet.</w:t>
+        <w:t xml:space="preserve">Ouvrez Outils → Atelier de requêtes, ou utilisez la petite icône de la barre du parc. Le petit crayon de Rechercher ouvre également l’Atelier ; une recette locale sélectionnée y est préparée pour modification. Dans l’Atelier, relisez le périmètre du parc affiché en haut : il peut différer de l’OU de Rechercher. Dans « Bibliothèque », sélectionnez le modèle Tous les postes recensés, puis « Utiliser cette requête » et « Aperçu local ». Cette requête inclut les comptes actifs et désactivés du périmètre. Une recherche textuelle dans Rechercher peut donner moins de lignes à cause de sa limite et de ses filtres ; la base et l'Atelier servent à examiner le recensement complet.</w:t>
       </w:r>
     </w:p>
     <w:p>
@@ -6896,7 +6913,7 @@
           <wp:inline distT="0" distB="0" distL="0" distR="0">
             <wp:extent cx="5762625" cy="3724275"/>
             <wp:effectExtent t="0" r="0" b="0" l="0"/>
-            <wp:docPr id="1" name="atelier-requetes" descr="Atelier de requêtes : onglet Résultats et liste paginée des postes recensés ; données fictives" title="Figure 12"/>
+            <wp:docPr id="1" name="atelier-requetes" descr="Atelier de requêtes : onglet Aperçu et liste paginée des postes recensés ; données fictives" title="Figure 12"/>
             <wp:cNvGraphicFramePr>
               <a:graphicFrameLocks xmlns:a="http://schemas.openxmlformats.org/drawingml/2006/main" noChangeAspect="1"/>
             </wp:cNvGraphicFramePr>
@@ -6953,7 +6970,7 @@
           <w:sz w:val="17"/>
           <w:szCs w:val="17"/>
         </w:rPr>
-        <w:t xml:space="preserve">Atelier de requêtes : onglet Résultats et liste paginée des postes recensés ; données fictives</w:t>
+        <w:t xml:space="preserve">Atelier de requêtes : onglet Aperçu et liste paginée des postes recensés ; données fictives</w:t>
       </w:r>
     </w:p>
     <w:p>
@@ -6973,7 +6990,7 @@
       <w:r>
         <w:drawing>
           <wp:inline distT="0" distB="0" distL="0" distR="0">
-            <wp:extent cx="4676775" cy="1285875"/>
+            <wp:extent cx="4676775" cy="638175"/>
             <wp:effectExtent t="0" r="0" b="0" l="0"/>
             <wp:docPr id="1" name="atelier-desactives" descr="Comptes désactivés : trois postes restent visibles dans l’Atelier ; données fictives" title="Figure 13"/>
             <wp:cNvGraphicFramePr>
@@ -6990,7 +7007,7 @@
                   </pic:nvPicPr>
                   <pic:blipFill>
                     <a:blip r:embed="rId22" cstate="none"/>
-                    <a:srcRect l="14531" t="37419" r="65156" b="53952"/>
+                    <a:srcRect l="14583" t="36290" r="3802" b="46371"/>
                     <a:stretch>
                       <a:fillRect/>
                     </a:stretch>
@@ -6998,7 +7015,7 @@
                   <pic:spPr bwMode="auto">
                     <a:xfrm>
                       <a:off x="0" y="0"/>
-                      <a:ext cx="4676775" cy="1285875"/>
+                      <a:ext cx="4676775" cy="638175"/>
                     </a:xfrm>
                     <a:prstGeom prst="rect">
                       <a:avLst/>
@@ -7049,7 +7066,7 @@
         <w:keepNext w:val="false"/>
       </w:pPr>
       <w:r>
-        <w:t xml:space="preserve">L’onglet « Bibliothèque » présente 152 modèles livrés dans 14 catégories, ainsi que vos requêtes personnelles. Recherchez un sujet, filtrez par catégorie ou par source (« Modèles livrés » ou « Mes requêtes »), puis sélectionnez une ligne. Lisez sa description et les informations nécessaires avant de cliquer sur « Utiliser cette requête ». Ajustez les conditions dans « 1. Créer », puis cliquez sur « Exécuter » pour consulter les résultats locaux. Le sélecteur rapide et « Charger », en haut de l’Atelier, restent disponibles.</w:t>
+        <w:t xml:space="preserve">L’onglet « Bibliothèque » présente les modèles livrés, regroupés par catégorie, ainsi que vos requêtes personnelles. Recherchez un sujet, filtrez par catégorie ou par source (« Modèles livrés » ou « Mes requêtes »), puis sélectionnez une ligne. Lisez sa description et les informations nécessaires avant de cliquer sur « Utiliser cette requête ». Ajustez les conditions dans « 1. Créer », puis cliquez sur « Aperçu local » pour consulter les résultats locaux. Le sélecteur rapide et « Charger », en haut de l’Atelier, restent disponibles.</w:t>
       </w:r>
     </w:p>
     <w:p>
@@ -7307,7 +7324,7 @@
         <w:t xml:space="preserve">Lire le résultat.</w:t>
       </w:r>
       <w:r>
-        <w:t xml:space="preserve"> Cliquez sur « Exécuter » : l’onglet « Résultats » s’ouvre. Contrôlez le total et la date des mesures. Une valeur absente ne signifie pas que le disque est plein.</w:t>
+        <w:t xml:space="preserve"> Cliquez sur « Aperçu local » : l’onglet « 2. Aperçu » s’ouvre. Contrôlez le total et la date des mesures. Une valeur absente ne signifie pas que le disque est plein.</w:t>
       </w:r>
     </w:p>
     <w:p>
@@ -7319,7 +7336,7 @@
       <w:r>
         <w:drawing>
           <wp:inline distT="0" distB="0" distL="0" distR="0">
-            <wp:extent cx="5762625" cy="381000"/>
+            <wp:extent cx="5762625" cy="866775"/>
             <wp:effectExtent t="0" r="0" b="0" l="0"/>
             <wp:docPr id="1" name="atelier-condition" descr="Condition numérique : espace libre du disque système inférieur à 20 % ; données fictives" title="Figure 16"/>
             <wp:cNvGraphicFramePr>
@@ -7336,7 +7353,7 @@
                   </pic:nvPicPr>
                   <pic:blipFill>
                     <a:blip r:embed="rId25" cstate="none"/>
-                    <a:srcRect l="14479" t="38145" r="45052" b="57661"/>
+                    <a:srcRect l="14635" t="47581" r="35365" b="40726"/>
                     <a:stretch>
                       <a:fillRect/>
                     </a:stretch>
@@ -7344,7 +7361,7 @@
                   <pic:spPr bwMode="auto">
                     <a:xfrm>
                       <a:off x="0" y="0"/>
-                      <a:ext cx="5762625" cy="381000"/>
+                      <a:ext cx="5762625" cy="866775"/>
                     </a:xfrm>
                     <a:prstGeom prst="rect">
                       <a:avLst/>
@@ -7400,7 +7417,7 @@
         <w:t xml:space="preserve">Nommer et enregistrer.</w:t>
       </w:r>
       <w:r>
-        <w:t xml:space="preserve"> Revenez dans « 1. Créer », donnez un nom explicite à la requête puis cliquez sur « Enregistrer ». Retrouvez-la dans la liste pour la réutiliser.</w:t>
+        <w:t xml:space="preserve"> Passez dans « 3. Enregistrer », donnez un nom explicite à la requête puis cliquez sur « Enregistrer ». Retrouvez-la dans la liste pour la réutiliser.</w:t>
       </w:r>
     </w:p>
     <w:p>
@@ -7412,7 +7429,7 @@
       <w:r>
         <w:drawing>
           <wp:inline distT="0" distB="0" distL="0" distR="0">
-            <wp:extent cx="5762625" cy="1123950"/>
+            <wp:extent cx="5762625" cy="1714500"/>
             <wp:effectExtent t="0" r="0" b="0" l="0"/>
             <wp:docPr id="1" name="atelier-bibliotheque" descr="Requête nommée enregistrée dans la bibliothèque de l’Atelier ; données fictives" title="Figure 17"/>
             <wp:cNvGraphicFramePr>
@@ -7429,7 +7446,7 @@
                   </pic:nvPicPr>
                   <pic:blipFill>
                     <a:blip r:embed="rId26" cstate="none"/>
-                    <a:srcRect l="14427" t="37963" r="40260" b="46389"/>
+                    <a:srcRect l="14583" t="41667" r="3802" b="15278"/>
                     <a:stretch>
                       <a:fillRect/>
                     </a:stretch>
@@ -7437,7 +7454,7 @@
                   <pic:spPr bwMode="auto">
                     <a:xfrm>
                       <a:off x="0" y="0"/>
-                      <a:ext cx="5762625" cy="1123950"/>
+                      <a:ext cx="5762625" cy="1714500"/>
                     </a:xfrm>
                     <a:prstGeom prst="rect">
                       <a:avLst/>
@@ -7493,7 +7510,7 @@
         <w:t xml:space="preserve">Ajouter au tableau.</w:t>
       </w:r>
       <w:r>
-        <w:t xml:space="preserve"> Dans « 1. Créer », choisissez la destination « Tableau de bord général », puis une présentation : Indicateur, Texte, Barres, Camembert ou Colonnes. Cliquez sur « Créer une sonde dashboard ». Le widget reprend la requête ; sa petite icône de détail permet de revenir aux postes concernés.</w:t>
+        <w:t xml:space="preserve"> Dans « 3. Enregistrer », choisissez la destination « Tableau de bord général », puis la représentation souhaitée. Cliquez sur « Créer une sonde dashboard ». Le widget reprend la requête ; sa petite icône de détail permet de revenir aux postes concernés.</w:t>
       </w:r>
     </w:p>
     <w:p>
@@ -7505,7 +7522,7 @@
       <w:r>
         <w:drawing>
           <wp:inline distT="0" distB="0" distL="0" distR="0">
-            <wp:extent cx="4324350" cy="1866900"/>
+            <wp:extent cx="4324350" cy="1000125"/>
             <wp:effectExtent t="0" r="0" b="0" l="0"/>
             <wp:docPr id="1" name="accueil-sonde-requete" descr="Sonde du tableau de bord créée depuis la requête sur les disques ; données fictives" title="Figure 18"/>
             <wp:cNvGraphicFramePr>
@@ -7522,7 +7539,7 @@
                   </pic:nvPicPr>
                   <pic:blipFill>
                     <a:blip r:embed="rId27" cstate="none"/>
-                    <a:srcRect l="11354" t="75887" r="69427" b="11290"/>
+                    <a:srcRect l="11458" t="72177" r="44688" b="12097"/>
                     <a:stretch>
                       <a:fillRect/>
                     </a:stretch>
@@ -7530,7 +7547,7 @@
                   <pic:spPr bwMode="auto">
                     <a:xfrm>
                       <a:off x="0" y="0"/>
-                      <a:ext cx="4324350" cy="1866900"/>
+                      <a:ext cx="4324350" cy="1000125"/>
                     </a:xfrm>
                     <a:prstGeom prst="rect">
                       <a:avLst/>
@@ -7586,7 +7603,7 @@
         <w:t xml:space="preserve">Filtrer Rechercher.</w:t>
       </w:r>
       <w:r>
-        <w:t xml:space="preserve"> Dans « 1. Créer », cliquez sur « Appliquer aux résultats de Recherche ». Le filtre utilise les identités des postes trouvés ; relisez la restriction affichée et effacez-la pour revenir à la liste habituelle.</w:t>
+        <w:t xml:space="preserve"> Dans « 3. Enregistrer », cliquez sur « Appliquer aux résultats de Recherche ». Le filtre utilise les identités des postes trouvés ; relisez la restriction affichée et effacez-la pour revenir à la liste habituelle.</w:t>
       </w:r>
     </w:p>
     <w:p>
@@ -7598,7 +7615,7 @@
       <w:r>
         <w:drawing>
           <wp:inline distT="0" distB="0" distL="0" distR="0">
-            <wp:extent cx="5762625" cy="295275"/>
+            <wp:extent cx="5762625" cy="581025"/>
             <wp:effectExtent t="0" r="0" b="0" l="0"/>
             <wp:docPr id="1" name="recherche-requete" descr="Rechercher filtré par les postes trouvés dans l’Atelier ; données fictives" title="Figure 19"/>
             <wp:cNvGraphicFramePr>
@@ -7615,7 +7632,7 @@
                   </pic:nvPicPr>
                   <pic:blipFill>
                     <a:blip r:embed="rId28" cstate="none"/>
-                    <a:srcRect l="26875" t="35926" r="34167" b="60556"/>
+                    <a:srcRect l="26979" t="28981" r="1250" b="58056"/>
                     <a:stretch>
                       <a:fillRect/>
                     </a:stretch>
@@ -7623,7 +7640,7 @@
                   <pic:spPr bwMode="auto">
                     <a:xfrm>
                       <a:off x="0" y="0"/>
-                      <a:ext cx="5762625" cy="295275"/>
+                      <a:ext cx="5762625" cy="581025"/>
                     </a:xfrm>
                     <a:prstGeom prst="rect">
                       <a:avLst/>
@@ -7674,7 +7691,7 @@
         <w:keepNext w:val="false"/>
       </w:pPr>
       <w:r>
-        <w:t xml:space="preserve">Le bouton « Atelier » du tableau de bord du poste ouvre la même bibliothèque de requêtes. Dans « 1. Créer », choisissez « Tableau de bord du poste » et la présentation souhaitée, puis « Créer une sonde dashboard ». Le widget applique la recette au poste actuellement sélectionné ; il sera réévalué lorsque vous changerez de poste.</w:t>
+        <w:t xml:space="preserve">Le bouton « Atelier » du tableau de bord du poste ouvre la même bibliothèque de requêtes. Dans « 3. Enregistrer », choisissez « Tableau de bord du poste » et la présentation souhaitée, puis « Créer une sonde dashboard ». Le widget applique la recette au poste actuellement sélectionné ; il sera réévalué lorsque vous changerez de poste.</w:t>
       </w:r>
     </w:p>
     <w:p>
@@ -7682,7 +7699,7 @@
         <w:keepNext w:val="false"/>
       </w:pPr>
       <w:r>
-        <w:t xml:space="preserve">« Tester sur le poste sélectionné » indique s’il correspond, ne correspond pas ou si le résultat reste inconnu. Ce test lit les données locales déjà disponibles, sans lancer de collecte. La grande liste « Résultats » de l’Atelier continue à afficher les postes de l’OU indiquée en haut ; elle ne se transforme pas en liste d’un seul poste.</w:t>
+        <w:t xml:space="preserve">« Tester sur le poste sélectionné » indique s’il correspond, ne correspond pas ou si le résultat reste inconnu. Ce test lit les données locales déjà disponibles, sans lancer de collecte. La grande liste « 2. Aperçu » de l’Atelier continue à afficher les postes de l’OU indiquée en haut ; elle ne se transforme pas en liste d’un seul poste.</w:t>
       </w:r>
     </w:p>
     <w:p>
@@ -7694,7 +7711,7 @@
       <w:r>
         <w:drawing>
           <wp:inline distT="0" distB="0" distL="0" distR="0">
-            <wp:extent cx="5762625" cy="1724025"/>
+            <wp:extent cx="5762625" cy="2838450"/>
             <wp:effectExtent t="0" r="0" b="0" l="0"/>
             <wp:docPr id="1" name="atelier-poste" descr="Atelier : destination Poste et aperçu local de la requête sur le poste sélectionné ; données fictives" title="Figure 20"/>
             <wp:cNvGraphicFramePr>
@@ -7711,7 +7728,7 @@
                   </pic:nvPicPr>
                   <pic:blipFill>
                     <a:blip r:embed="rId29" cstate="none"/>
-                    <a:srcRect l="14479" t="52903" r="41927" b="26935"/>
+                    <a:srcRect l="13021" t="24194" r="2344" b="11290"/>
                     <a:stretch>
                       <a:fillRect/>
                     </a:stretch>
@@ -7719,7 +7736,7 @@
                   <pic:spPr bwMode="auto">
                     <a:xfrm>
                       <a:off x="0" y="0"/>
-                      <a:ext cx="5762625" cy="1724025"/>
+                      <a:ext cx="5762625" cy="2838450"/>
                     </a:xfrm>
                     <a:prstGeom prst="rect">
                       <a:avLst/>
@@ -7765,7 +7782,7 @@
       <w:r>
         <w:drawing>
           <wp:inline distT="0" distB="0" distL="0" distR="0">
-            <wp:extent cx="4324350" cy="1924050"/>
+            <wp:extent cx="4324350" cy="1028700"/>
             <wp:effectExtent t="0" r="0" b="0" l="0"/>
             <wp:docPr id="1" name="poste-sonde-requete" descr="Tableau du poste : widget créé depuis la même bibliothèque de requêtes ; données fictives" title="Figure 21"/>
             <wp:cNvGraphicFramePr>
@@ -7782,7 +7799,7 @@
                   </pic:nvPicPr>
                   <pic:blipFill>
                     <a:blip r:embed="rId30" cstate="none"/>
-                    <a:srcRect l="12500" t="74259" r="68750" b="10926"/>
+                    <a:srcRect l="12656" t="70093" r="44844" b="11852"/>
                     <a:stretch>
                       <a:fillRect/>
                     </a:stretch>
@@ -7790,7 +7807,7 @@
                   <pic:spPr bwMode="auto">
                     <a:xfrm>
                       <a:off x="0" y="0"/>
-                      <a:ext cx="4324350" cy="1924050"/>
+                      <a:ext cx="4324350" cy="1028700"/>
                     </a:xfrm>
                     <a:prstGeom prst="rect">
                       <a:avLst/>
@@ -7941,7 +7958,7 @@
       <w:r>
         <w:drawing>
           <wp:inline distT="0" distB="0" distL="0" distR="0">
-            <wp:extent cx="5762625" cy="676275"/>
+            <wp:extent cx="5762625" cy="714375"/>
             <wp:effectExtent t="0" r="0" b="0" l="0"/>
             <wp:docPr id="1" name="atelier-collecte" descr="Réglages de la collecte : parallélisme et durée de réutilisation des mesures ; données fictives" title="Figure 22"/>
             <wp:cNvGraphicFramePr>
@@ -7958,7 +7975,7 @@
                   </pic:nvPicPr>
                   <pic:blipFill>
                     <a:blip r:embed="rId31" cstate="none"/>
-                    <a:srcRect l="14583" t="73387" r="52917" b="20726"/>
+                    <a:srcRect l="14688" t="81774" r="52760" b="12016"/>
                     <a:stretch>
                       <a:fillRect/>
                     </a:stretch>
@@ -7966,7 +7983,7 @@
                   <pic:spPr bwMode="auto">
                     <a:xfrm>
                       <a:off x="0" y="0"/>
-                      <a:ext cx="5762625" cy="676275"/>
+                      <a:ext cx="5762625" cy="714375"/>
                     </a:xfrm>
                     <a:prstGeom prst="rect">
                       <a:avLst/>
@@ -8383,7 +8400,7 @@
       <w:r>
         <w:drawing>
           <wp:inline distT="0" distB="0" distL="0" distR="0">
-            <wp:extent cx="5762625" cy="1323975"/>
+            <wp:extent cx="5762625" cy="1657350"/>
             <wp:effectExtent t="0" r="0" b="0" l="0"/>
             <wp:docPr id="1" name="base-commandes" descr="Mise à jour de la base : OU choisie et commande de relecture ciblée ; données fictives" title="Figure 23"/>
             <wp:cNvGraphicFramePr>
@@ -8400,7 +8417,7 @@
                   </pic:nvPicPr>
                   <pic:blipFill>
                     <a:blip r:embed="rId32" cstate="none"/>
-                    <a:srcRect l="12917" t="18889" r="44635" b="63796"/>
+                    <a:srcRect l="12865" t="22500" r="2083" b="33981"/>
                     <a:stretch>
                       <a:fillRect/>
                     </a:stretch>
@@ -8408,7 +8425,7 @@
                   <pic:spPr bwMode="auto">
                     <a:xfrm>
                       <a:off x="0" y="0"/>
-                      <a:ext cx="5762625" cy="1323975"/>
+                      <a:ext cx="5762625" cy="1657350"/>
                     </a:xfrm>
                     <a:prstGeom prst="rect">
                       <a:avLst/>
@@ -9995,7 +10012,7 @@
       <w:r>
         <w:drawing>
           <wp:inline distT="0" distB="0" distL="0" distR="0">
-            <wp:extent cx="5762625" cy="4486275"/>
+            <wp:extent cx="5762625" cy="6924675"/>
             <wp:effectExtent t="0" r="0" b="0" l="0"/>
             <wp:docPr id="1" name="editeur-widget" descr="Panneau « Ajouter un widget » : recherche, liste des informations, réglages à droite et aperçu du widget « Disque systeme »" title="Figure 26"/>
             <wp:cNvGraphicFramePr>
@@ -10012,7 +10029,7 @@
                   </pic:nvPicPr>
                   <pic:blipFill>
                     <a:blip r:embed="rId35" cstate="none"/>
-                    <a:srcRect l="57708" t="1481" r="833" b="41111"/>
+                    <a:srcRect l="55208" t="1296" r="729" b="4537"/>
                     <a:stretch>
                       <a:fillRect/>
                     </a:stretch>
@@ -10020,7 +10037,7 @@
                   <pic:spPr bwMode="auto">
                     <a:xfrm>
                       <a:off x="0" y="0"/>
-                      <a:ext cx="5762625" cy="4486275"/>
+                      <a:ext cx="5762625" cy="6924675"/>
                     </a:xfrm>
                     <a:prstGeom prst="rect">
                       <a:avLst/>
@@ -11818,7 +11835,7 @@
       <w:r>
         <w:drawing>
           <wp:inline distT="0" distB="0" distL="0" distR="0">
-            <wp:extent cx="5762625" cy="2790825"/>
+            <wp:extent cx="5762625" cy="6181725"/>
             <wp:effectExtent t="0" r="0" b="0" l="0"/>
             <wp:docPr id="1" name="etat-moteur" descr="Panneau des opérations et santé du moteur ; valeurs de démonstration" title="Figure 29"/>
             <wp:cNvGraphicFramePr>
@@ -11835,7 +11852,7 @@
                   </pic:nvPicPr>
                   <pic:blipFill>
                     <a:blip r:embed="rId38" cstate="none"/>
-                    <a:srcRect l="833" t="5926" r="66875" b="66296"/>
+                    <a:srcRect l="781" t="5833" r="66875" b="32500"/>
                     <a:stretch>
                       <a:fillRect/>
                     </a:stretch>
@@ -11843,7 +11860,7 @@
                   <pic:spPr bwMode="auto">
                     <a:xfrm>
                       <a:off x="0" y="0"/>
-                      <a:ext cx="5762625" cy="2790825"/>
+                      <a:ext cx="5762625" cy="6181725"/>
                     </a:xfrm>
                     <a:prstGeom prst="rect">
                       <a:avLst/>

</xml_diff>

<commit_message>
WIP RC39: preserve critical Windows proofs and refreshed guides; tree patch pending
</commit_message>
<xml_diff>
--- a/DOC/Domenia-1.0-Guide-technicien.docx
+++ b/DOC/Domenia-1.0-Guide-technicien.docx
@@ -152,7 +152,7 @@
           <w:sz w:val="20"/>
           <w:szCs w:val="20"/>
         </w:rPr>
-        <w:t xml:space="preserve">Domenia 1.0 · RC1.17.20</w:t>
+        <w:t xml:space="preserve">Domenia 1.0 · RC1.17.39 (édition du texte)</w:t>
       </w:r>
     </w:p>
     <w:p>
@@ -173,7 +173,7 @@
           <w:sz w:val="20"/>
           <w:szCs w:val="20"/>
         </w:rPr>
-        <w:t xml:space="preserve">Exemples de l’interface avec des valeurs fictives.</w:t>
+        <w:t xml:space="preserve">Captures historiques de la RC1.17.20 avec des données fictives, conservées comme repères visuels ; certains détails de l’interface peuvent différer de la version décrite.</w:t>
       </w:r>
     </w:p>
     <w:p>
@@ -354,6 +354,14 @@
         <w:t xml:space="preserve">1 Trouver une personne ou un poste</w:t>
       </w:r>
       <w:bookmarkEnd w:id="1"/>
+    </w:p>
+    <w:p>
+      <w:pPr>
+        <w:keepNext w:val="false"/>
+      </w:pPr>
+      <w:r>
+        <w:t xml:space="preserve">Édition du texte mise à jour pour Domenia 1.0 · RC1.17.39. Les captures d’écran restent celles de la RC1.17.20, avec des données fictives ; elles servent de repères visuels et certains détails de l’interface peuvent différer.</w:t>
+      </w:r>
     </w:p>
     <w:p>
       <w:pPr>
@@ -767,6 +775,14 @@
         <w:t xml:space="preserve"> Double-cliquez sur la ligne, ou appuyez sur Entrée. La page « Fiche » s'ouvre sur l'onglet « Resume ». Si l'objet a changé dans l'annuaire depuis son ouverture, « Relire depuis lʼannuaire » le relit sur le contrôleur, lui seul : la liste et les autres fiches restent telles quelles.</w:t>
       </w:r>
     </w:p>
+    <w:p>
+      <w:pPr>
+        <w:keepNext w:val="false"/>
+      </w:pPr>
+      <w:r>
+        <w:t xml:space="preserve">Lorsqu’une recherche est lancée ou qu’une fiche est ouverte, les données déjà présentes dans la base locale peuvent apparaître pendant la lecture Active Directory. Elles gardent leur date et leur provenance ; si la lecture échoue, les données connues restent disponibles. La saisie seule ne lance aucune recherche AD. Lorsqu’une autre recherche ou fiche remplace la précédente, une réponse tardive ne doit pas modifier la nouvelle vue.</w:t>
+      </w:r>
+    </w:p>
     <w:tbl>
       <w:tblPr>
         <w:tblW w:type="dxa" w:w="9638"/>
@@ -4059,6 +4075,14 @@
     </w:p>
     <w:p>
       <w:pPr>
+        <w:keepNext w:val="false"/>
+      </w:pPr>
+      <w:r>
+        <w:t xml:space="preserve">La santé distingue les postes évalués sans problème, les problèmes connus et les états inconnus. Une donnée absente ou trop ancienne ne signifie pas que le poste est sain. Relisez le périmètre, la date et la source ; l’explication d’un point indique aussi les données manquantes et la vue où lancer leur collecte.</w:t>
+      </w:r>
+    </w:p>
+    <w:p>
+      <w:pPr>
         <w:pStyle w:val="Heading2"/>
         <w:keepNext/>
       </w:pPr>
@@ -9223,6 +9247,14 @@
     </w:p>
     <w:p>
       <w:pPr>
+        <w:keepNext w:val="false"/>
+      </w:pPr>
+      <w:r>
+        <w:t xml:space="preserve">Pour conserver une sauvegarde complète récente, copiez ensemble le fichier NOM.db et son annexe NOM.db.preferences.json. L’annexe contient les préférences et dispositions compatibles, sans secrets ni comptes de connexion. Une ancienne sauvegarde .db sans annexe restaure les données seules et conserve les préférences actuelles.</w:t>
+      </w:r>
+    </w:p>
+    <w:p>
+      <w:pPr>
         <w:keepNext/>
         <w:spacing w:after="60" w:before="120"/>
         <w:jc w:val="center"/>
@@ -10375,6 +10407,23 @@
       </w:r>
       <w:r>
         <w:t xml:space="preserve">Le tableau affiche vos widgets, dans l'ordre et à la taille choisis.</w:t>
+      </w:r>
+    </w:p>
+    <w:p>
+      <w:pPr>
+        <w:pStyle w:val="Heading2"/>
+        <w:keepNext/>
+      </w:pPr>
+      <w:r>
+        <w:t xml:space="preserve">Dispositions prêtes</w:t>
+      </w:r>
+    </w:p>
+    <w:p>
+      <w:pPr>
+        <w:keepNext w:val="false"/>
+      </w:pPr>
+      <w:r>
+        <w:t xml:space="preserve">Communiquer avec un utilisateur, inventorier un poste ou surveiller un lot de postes : trois dispositions prêtes existent, « Support », « Inventaire » et « Santé », dans le menu de personnalisation. Les appliquer ne lance aucune collecte : elles disposent les rubriques utiles en tête, ajoutent les cartes connues manquantes et conservent chaque widget personnalisé (identifiant, taille, titre ou pause). Même annulation et même enregistrement qu'après tout autre changement de tableau.</w:t>
       </w:r>
     </w:p>
     <w:p>

</xml_diff>

<commit_message>
RC1.17.39: livrer les améliorations et qualifier les parcours critiques
Aperçu local avant AD, arbre virtualisé, caches de widgets, collectes et stockage renforcés. Guides, suivi des 60 points et packs DEV/PROD régénérés. Contrôles Windows ciblés documentés; endurance, DPI et accessibilité complète restent hors passe. VM conservée.
</commit_message>
<xml_diff>
--- a/DOC/Domenia-1.0-Guide-technicien.docx
+++ b/DOC/Domenia-1.0-Guide-technicien.docx
@@ -152,7 +152,7 @@
           <w:sz w:val="20"/>
           <w:szCs w:val="20"/>
         </w:rPr>
-        <w:t xml:space="preserve">Domenia 1.0 · RC1.17.20</w:t>
+        <w:t xml:space="preserve">Domenia 1.0 · RC1.17.39 (édition du texte)</w:t>
       </w:r>
     </w:p>
     <w:p>
@@ -173,7 +173,7 @@
           <w:sz w:val="20"/>
           <w:szCs w:val="20"/>
         </w:rPr>
-        <w:t xml:space="preserve">Exemples de l’interface avec des valeurs fictives.</w:t>
+        <w:t xml:space="preserve">Captures historiques de la RC1.17.20 avec des données fictives, conservées comme repères visuels ; certains détails de l’interface peuvent différer de la version décrite.</w:t>
       </w:r>
     </w:p>
     <w:p>
@@ -354,6 +354,14 @@
         <w:t xml:space="preserve">1 Trouver une personne ou un poste</w:t>
       </w:r>
       <w:bookmarkEnd w:id="1"/>
+    </w:p>
+    <w:p>
+      <w:pPr>
+        <w:keepNext w:val="false"/>
+      </w:pPr>
+      <w:r>
+        <w:t xml:space="preserve">Édition du texte mise à jour pour Domenia 1.0 · RC1.17.39. Les captures d’écran restent celles de la RC1.17.20, avec des données fictives ; elles servent de repères visuels et certains détails de l’interface peuvent différer.</w:t>
+      </w:r>
     </w:p>
     <w:p>
       <w:pPr>
@@ -767,6 +775,14 @@
         <w:t xml:space="preserve"> Double-cliquez sur la ligne, ou appuyez sur Entrée. La page « Fiche » s'ouvre sur l'onglet « Resume ». Si l'objet a changé dans l'annuaire depuis son ouverture, « Relire depuis lʼannuaire » le relit sur le contrôleur, lui seul : la liste et les autres fiches restent telles quelles.</w:t>
       </w:r>
     </w:p>
+    <w:p>
+      <w:pPr>
+        <w:keepNext w:val="false"/>
+      </w:pPr>
+      <w:r>
+        <w:t xml:space="preserve">Lorsqu’une recherche est lancée ou qu’une fiche est ouverte, les données déjà présentes dans la base locale peuvent apparaître pendant la lecture Active Directory. Elles gardent leur date et leur provenance ; si la lecture échoue, les données connues restent disponibles. La saisie seule ne lance aucune recherche AD. Lorsqu’une autre recherche ou fiche remplace la précédente, une réponse tardive ne doit pas modifier la nouvelle vue.</w:t>
+      </w:r>
+    </w:p>
     <w:tbl>
       <w:tblPr>
         <w:tblW w:type="dxa" w:w="9638"/>
@@ -4059,6 +4075,14 @@
     </w:p>
     <w:p>
       <w:pPr>
+        <w:keepNext w:val="false"/>
+      </w:pPr>
+      <w:r>
+        <w:t xml:space="preserve">La santé distingue les postes évalués sans problème, les problèmes connus et les états inconnus. Une donnée absente ou trop ancienne ne signifie pas que le poste est sain. Relisez le périmètre, la date et la source ; l’explication d’un point indique aussi les données manquantes et la vue où lancer leur collecte.</w:t>
+      </w:r>
+    </w:p>
+    <w:p>
+      <w:pPr>
         <w:pStyle w:val="Heading2"/>
         <w:keepNext/>
       </w:pPr>
@@ -9223,6 +9247,14 @@
     </w:p>
     <w:p>
       <w:pPr>
+        <w:keepNext w:val="false"/>
+      </w:pPr>
+      <w:r>
+        <w:t xml:space="preserve">Pour conserver une sauvegarde complète récente, copiez ensemble le fichier NOM.db et son annexe NOM.db.preferences.json. L’annexe contient les préférences et dispositions compatibles, sans secrets ni comptes de connexion. Une ancienne sauvegarde .db sans annexe restaure les données seules et conserve les préférences actuelles.</w:t>
+      </w:r>
+    </w:p>
+    <w:p>
+      <w:pPr>
         <w:keepNext/>
         <w:spacing w:after="60" w:before="120"/>
         <w:jc w:val="center"/>
@@ -10375,6 +10407,23 @@
       </w:r>
       <w:r>
         <w:t xml:space="preserve">Le tableau affiche vos widgets, dans l'ordre et à la taille choisis.</w:t>
+      </w:r>
+    </w:p>
+    <w:p>
+      <w:pPr>
+        <w:pStyle w:val="Heading2"/>
+        <w:keepNext/>
+      </w:pPr>
+      <w:r>
+        <w:t xml:space="preserve">Dispositions prêtes</w:t>
+      </w:r>
+    </w:p>
+    <w:p>
+      <w:pPr>
+        <w:keepNext w:val="false"/>
+      </w:pPr>
+      <w:r>
+        <w:t xml:space="preserve">Communiquer avec un utilisateur, inventorier un poste ou surveiller un lot de postes : trois dispositions prêtes existent, « Support », « Inventaire » et « Santé », dans le menu de personnalisation. Les appliquer ne lance aucune collecte : elles disposent les rubriques utiles en tête, ajoutent les cartes connues manquantes et conservent chaque widget personnalisé (identifiant, taille, titre ou pause). Même annulation et même enregistrement qu'après tout autre changement de tableau.</w:t>
       </w:r>
     </w:p>
     <w:p>

</xml_diff>